<commit_message>
Document Moderate example workflow
</commit_message>
<xml_diff>
--- a/retinacheck-model/retinacheck-prototype-overview.docx
+++ b/retinacheck-model/retinacheck-prototype-overview.docx
@@ -508,6 +508,62 @@
     <w:p>
       <w:pPr>
         <w:pStyle w:val="Heading1"/>
+      </w:pPr>
+      <w:r>
+        <w:rPr>
+          <w:color w:val="000000"/>
+        </w:rPr>
+        <w:t>Testing with a Moderate example</w:t>
+      </w:r>
+    </w:p>
+    <w:p>
+      <w:pPr/>
+      <w:r>
+        <w:rPr>
+          <w:color w:val="000000"/>
+        </w:rPr>
+        <w:t>After the Kaggle notebook completes the validation comparison, a separate code cell can search for a validation image whose recorded grade and hybrid model prediction are both Moderate (Grade 2). If no image matches, no sample file is created.</w:t>
+      </w:r>
+    </w:p>
+    <w:p>
+      <w:pPr/>
+      <w:r>
+        <w:rPr>
+          <w:color w:val="000000"/>
+        </w:rPr>
+        <w:t>1. When a match exists, the cell saves the original image as moderate-dr-correctly-predicted.png in /kaggle/working/outputs.</w:t>
+      </w:r>
+    </w:p>
+    <w:p>
+      <w:pPr/>
+      <w:r>
+        <w:rPr>
+          <w:color w:val="000000"/>
+        </w:rPr>
+        <w:t>2. In Kaggle's Output panel, open the outputs folder and download moderate-dr-correctly-predicted.png.</w:t>
+      </w:r>
+    </w:p>
+    <w:p>
+      <w:pPr/>
+      <w:r>
+        <w:rPr>
+          <w:color w:val="000000"/>
+        </w:rPr>
+        <w:t>3. In the local prototype, choose that file with Choose an image, then click Analyze with model.</w:t>
+      </w:r>
+    </w:p>
+    <w:p>
+      <w:pPr/>
+      <w:r>
+        <w:rPr>
+          <w:color w:val="000000"/>
+        </w:rPr>
+        <w:t>This APTOS image is not included in the public repository; access and use it according to the Kaggle competition rules. The checked prototype model also predicted Moderate for the example, but scores are model outputs, not clinical certainty, and another saved model version may produce a different result.</w:t>
+      </w:r>
+    </w:p>
+    <w:p>
+      <w:pPr>
+        <w:pStyle w:val="Heading1"/>
         <w:keepNext/>
       </w:pPr>
       <w:r>

</xml_diff>

<commit_message>
Update prototype overview for model comparison
</commit_message>
<xml_diff>
--- a/retinacheck-model/retinacheck-prototype-overview.docx
+++ b/retinacheck-model/retinacheck-prototype-overview.docx
@@ -23,7 +23,7 @@
           <w:color w:val="000000"/>
           <w:sz w:val="24"/>
         </w:rPr>
-        <w:t>How the hybrid model, webpage and Grad-CAM work together</w:t>
+        <w:t>How the InceptionV3 baseline, hybrid model, webpage and Grad-CAM work together</w:t>
       </w:r>
     </w:p>
     <w:p>
@@ -34,7 +34,7 @@
         <w:rPr>
           <w:color w:val="000000"/>
         </w:rPr>
-        <w:t>RetinaCheck is a local research prototype for exploring the thesis workflow. A user uploads a retinal fundus image, the saved InceptionV3–ResNet50 model predicts one of five severity grades, and Grad-CAM produces a visual overlay of regions that influenced the model score.</w:t>
+        <w:t>RetinaCheck is a local research prototype for exploring the thesis workflow. A user uploads a retinal fundus image, and the webpage runs both the InceptionV3 baseline and the InceptionV3–ResNet50 hybrid model on that same image. It displays each model’s predicted severity grade and class scores side by side; a Grad-CAM overlay is generated for the hybrid model.</w:t>
       </w:r>
     </w:p>
     <w:p>
@@ -54,7 +54,7 @@
         <w:rPr>
           <w:color w:val="000000"/>
         </w:rPr>
-        <w:t>The browser page is connected to the trained hybrid model saved from Kaggle. It performs inference only; it does not train or update the model. The prediction and heatmap are generated on the same computer by a local Python server.</w:t>
+        <w:t>The browser page loads two trained models saved from Kaggle: an InceptionV3 baseline and the InceptionV3–ResNet50 + SE hybrid. It performs inference only; it does not train or update either model. Both predictions and the hybrid heatmap are generated on the same computer by a local Python server.</w:t>
       </w:r>
     </w:p>
     <w:p>
@@ -69,7 +69,7 @@
           <w:color w:val="000000"/>
           <w:sz w:val="30"/>
         </w:rPr>
-        <w:t>What the model is and what each part does</w:t>
+        <w:t>What the models are and what each part does</w:t>
       </w:r>
     </w:p>
     <w:p>
@@ -81,13 +81,12 @@
           <w:b/>
           <w:color w:val="000000"/>
         </w:rPr>
-        <w:t xml:space="preserve">Hybrid model: </w:t>
+        <w:t>InceptionV3 baseline: A single-branch convolutional neural network (CNN) used as the comparison model. It provides a reference prediction for the same uploaded image.</w:t>
       </w:r>
       <w:r>
         <w:rPr>
           <w:color w:val="000000"/>
         </w:rPr>
-        <w:t>A convolutional neural network (CNN) with two image-analysis branches. It combines the visual features learned by both branches before predicting a grade.</w:t>
       </w:r>
     </w:p>
     <w:p>
@@ -99,13 +98,12 @@
           <w:b/>
           <w:color w:val="000000"/>
         </w:rPr>
-        <w:t xml:space="preserve">InceptionV3: </w:t>
+        <w:t>InceptionV3 branch: In the hybrid, this branch looks for image patterns at different scales, from small details to broader structures.</w:t>
       </w:r>
       <w:r>
         <w:rPr>
           <w:color w:val="000000"/>
         </w:rPr>
-        <w:t>Looks for image patterns at different scales, from small details to broader structures.</w:t>
       </w:r>
     </w:p>
     <w:p>
@@ -117,13 +115,12 @@
           <w:b/>
           <w:color w:val="000000"/>
         </w:rPr>
-        <w:t xml:space="preserve">ResNet50: </w:t>
+        <w:t>ResNet50 branch: Uses shortcut connections between layers to help a deep network learn useful image patterns.</w:t>
       </w:r>
       <w:r>
         <w:rPr>
           <w:color w:val="000000"/>
         </w:rPr>
-        <w:t>Uses shortcut connections between layers to help a deep network learn useful image patterns.</w:t>
       </w:r>
     </w:p>
     <w:p>
@@ -135,13 +132,12 @@
           <w:b/>
           <w:color w:val="000000"/>
         </w:rPr>
-        <w:t xml:space="preserve">Feature fusion and SE: </w:t>
+        <w:t>Feature fusion and SE: The hybrid joins information from the InceptionV3 and ResNet50 branches. The squeeze-and-excitation (SE) block learns which combined features should receive more emphasis.</w:t>
       </w:r>
       <w:r>
         <w:rPr>
           <w:color w:val="000000"/>
         </w:rPr>
-        <w:t>Feature fusion joins information from both branches. The squeeze-and-excitation (SE) block learns which combined features should receive more emphasis.</w:t>
       </w:r>
     </w:p>
     <w:p>
@@ -153,13 +149,12 @@
           <w:b/>
           <w:color w:val="000000"/>
         </w:rPr>
-        <w:t xml:space="preserve">Classifier and Grad-CAM: </w:t>
+        <w:t>Classifiers and Grad-CAM: Each model scores five grades: No DR, Mild, Moderate, Severe and Proliferative DR. Grad-CAM is applied to the hybrid after prediction to visualize influential image regions; it does not prove a lesion is present.</w:t>
       </w:r>
       <w:r>
         <w:rPr>
           <w:color w:val="000000"/>
         </w:rPr>
-        <w:t>The classifier scores the five grades: No DR, Mild, Moderate, Severe and Proliferative DR. Grad-CAM is applied afterward to visualize regions that influenced a score; it does not prove a lesion is present.</w:t>
       </w:r>
     </w:p>
     <w:p>
@@ -379,7 +374,7 @@
         <w:rPr>
           <w:color w:val="000000"/>
         </w:rPr>
-        <w:t>The hybrid model returns probabilities for No DR, Mild, Moderate, Severe and Proliferative DR.</w:t>
+        <w:t>Both trained models return probabilities for No DR, Mild, Moderate, Severe and Proliferative DR. The webpage displays each model’s top grade, score and five-class distribution for direct comparison.</w:t>
       </w:r>
     </w:p>
     <w:p>
@@ -392,7 +387,7 @@
         <w:rPr>
           <w:color w:val="000000"/>
         </w:rPr>
-        <w:t>Grad-CAM is calculated for the final convolutional feature maps in the InceptionV3 and ResNet50 branches. The two normalized maps are averaged and overlaid on the processed image.</w:t>
+        <w:t>For the hybrid only, Grad-CAM uses the final convolutional feature maps in the InceptionV3 and ResNet50 branches. The two normalized maps are averaged and overlaid on the processed image.</w:t>
       </w:r>
     </w:p>
     <w:p>
@@ -405,7 +400,7 @@
         <w:rPr>
           <w:color w:val="000000"/>
         </w:rPr>
-        <w:t>The server returns the predicted grade, its model score and the Grad-CAM overlay; JavaScript displays them on the page.</w:t>
+        <w:t>The server returns both model results and the hybrid Grad-CAM overlay; JavaScript displays the side-by-side comparison on the page.</w:t>
       </w:r>
     </w:p>
     <w:p>
@@ -430,7 +425,7 @@
         <w:rPr>
           <w:color w:val="000000"/>
         </w:rPr>
-        <w:t>The grade is the class with the highest model probability. The displayed percentage is the model’s output score for that class; it is not a measure of clinical certainty. The Grad-CAM overlay shows image regions that contributed to the score. It is a post-hoc explanation, not a lesion detector, and it does not confirm that a lesion is present.</w:t>
+        <w:t>Each model’s predicted grade is the class with its highest probability. The displayed percentage is that model’s output score for the class; it is not a measure of clinical certainty. Comparing the two model outputs shows where their predictions agree or differ. The hybrid Grad-CAM overlay shows image regions that contributed to the hybrid score. It is a post-hoc explanation, not a lesion detector, and does not confirm that a lesion is present.</w:t>
       </w:r>
     </w:p>
     <w:p>
@@ -468,7 +463,7 @@
         <w:rPr>
           <w:color w:val="000000"/>
         </w:rPr>
-        <w:t>Choose a real retinal fundus image and click Analyze with model.</w:t>
+        <w:t>Choose a real retinal fundus image and click Compare models. The prototype automatically classifies it with both trained models; the user does not select the result class.</w:t>
       </w:r>
     </w:p>
     <w:p>
@@ -494,7 +489,7 @@
         <w:rPr>
           <w:color w:val="000000"/>
         </w:rPr>
-        <w:t>The six synthetic sample images are preview-only. They are not analyzed by the model and should not be presented as real clinical examples.</w:t>
+        <w:t>The six synthetic sample images are preview-only. They are not analyzed by either model and should not be presented as real clinical examples.</w:t>
       </w:r>
     </w:p>
     <w:p>
@@ -502,7 +497,7 @@
         <w:rPr>
           <w:color w:val="000000"/>
         </w:rPr>
-        <w:t>The local prototype files are retinacheck-prototype.html (webpage), retinacheck_server.py (Python server), requirements-model.txt (package list), start-retinacheck.bat (launcher) and Hybrid_InceptionV3_ResNet50_SE_best.keras (trained hybrid model).</w:t>
+        <w:t>The local prototype files are retinacheck-prototype.html (webpage), retinacheck_server.py (Python server), requirements-model.txt (package list), start-retinacheck.bat (launcher), Hybrid_InceptionV3_ResNet50_SE_best.keras (trained hybrid model) and InceptionV3_baseline_best.keras (trained baseline model). Keep both model files beside retinacheck_server.py.</w:t>
       </w:r>
     </w:p>
     <w:p>
@@ -513,7 +508,7 @@
         <w:rPr>
           <w:color w:val="000000"/>
         </w:rPr>
-        <w:t>Testing with a Moderate example</w:t>
+        <w:t>Testing with correctly predicted grade examples</w:t>
       </w:r>
     </w:p>
     <w:p>
@@ -522,7 +517,7 @@
         <w:rPr>
           <w:color w:val="000000"/>
         </w:rPr>
-        <w:t>After the Kaggle notebook completes the validation comparison, a separate code cell can search for a validation image whose recorded grade and hybrid model prediction are both Moderate (Grade 2). If no image matches, no sample file is created.</w:t>
+        <w:t>The Kaggle notebook can save original validation images when the hybrid model’s prediction matches the recorded label. The Moderate example is generated separately; an additional cell creates examples for No DR, Mild, Severe and Proliferative DR.</w:t>
       </w:r>
     </w:p>
     <w:p>
@@ -531,7 +526,7 @@
         <w:rPr>
           <w:color w:val="000000"/>
         </w:rPr>
-        <w:t>1. When a match exists, the cell saves the original image as moderate-dr-correctly-predicted.png in /kaggle/working/outputs.</w:t>
+        <w:t>The four additional files are no-dr-correctly-predicted.png, mild-dr-correctly-predicted.png, severe-dr-correctly-predicted.png and proliferative-dr-correctly-predicted.png. They are saved in /kaggle/working/outputs at 3216 × 2136 pixels. The notebook output reports each image’s true label, hybrid prediction and score.</w:t>
       </w:r>
     </w:p>
     <w:p>
@@ -540,7 +535,7 @@
         <w:rPr>
           <w:color w:val="000000"/>
         </w:rPr>
-        <w:t>2. In Kaggle's Output panel, open the outputs folder and download moderate-dr-correctly-predicted.png.</w:t>
+        <w:t>In Kaggle’s Output panel, open the outputs folder and download the image files you want to demonstrate. In the local prototype, select a downloaded image with Choose an image and click Compare models to see the baseline and hybrid results side by side.</w:t>
       </w:r>
     </w:p>
     <w:p>
@@ -549,16 +544,7 @@
         <w:rPr>
           <w:color w:val="000000"/>
         </w:rPr>
-        <w:t>3. In the local prototype, choose that file with Choose an image, then click Analyze with model.</w:t>
-      </w:r>
-    </w:p>
-    <w:p>
-      <w:pPr/>
-      <w:r>
-        <w:rPr>
-          <w:color w:val="000000"/>
-        </w:rPr>
-        <w:t>This APTOS image is not included in the public repository; access and use it according to the Kaggle competition rules. The checked prototype model also predicted Moderate for the example, but scores are model outputs, not clinical certainty, and another saved model version may produce a different result.</w:t>
+        <w:t>The examples are APTOS validation images and are not included in the public repository. Access and use them according to the Kaggle competition rules. They were selected because the hybrid prediction matched the validation label; the baseline may predict a different grade. Model scores are outputs, not clinical certainty, and another saved model version may produce different results.</w:t>
       </w:r>
     </w:p>
     <w:p>
@@ -647,7 +633,7 @@
           <w:i/>
           <w:color w:val="000000"/>
         </w:rPr>
-        <w:t>“We developed a browser-based prototype using HTML, CSS and JavaScript, connected to a Python Flask server. The server applies the same image preparation used in our Kaggle notebook, runs the trained InceptionV3–ResNet50 hybrid model, and returns a five-grade prediction with a Grad-CAM overlay generated from both model branches. The prototype demonstrates model inference and explanation; it is not intended to replace professional diagnosis.”</w:t>
+        <w:t>“We developed a browser-based prototype using HTML, CSS and JavaScript, connected to a Python Flask server. The server applies the same image preparation used in our Kaggle notebook, runs both the InceptionV3 baseline and the InceptionV3–ResNet50 + SE hybrid on an uploaded image, and displays their five-grade predictions for direct comparison. A Grad-CAM overlay from both branches of the hybrid model helps visualize image regions that influenced its score. The prototype demonstrates model inference and explanation; it is not intended to replace professional diagnosis.”</w:t>
       </w:r>
     </w:p>
     <w:p>
@@ -658,7 +644,7 @@
       <w:r>
         <w:drawing>
           <wp:inline xmlns:a="http://schemas.openxmlformats.org/drawingml/2006/main" xmlns:pic="http://schemas.openxmlformats.org/drawingml/2006/picture">
-            <wp:extent cx="5897880" cy="684411"/>
+            <wp:extent cx="5897880" cy="982980"/>
             <wp:docPr id="1" name="Picture 1"/>
             <wp:cNvGraphicFramePr>
               <a:graphicFrameLocks noChangeAspect="1"/>
@@ -679,7 +665,7 @@
                   <pic:spPr>
                     <a:xfrm>
                       <a:off x="0" y="0"/>
-                      <a:ext cx="5897880" cy="684411"/>
+                      <a:ext cx="5897880" cy="982980"/>
                     </a:xfrm>
                     <a:prstGeom prst="rect"/>
                   </pic:spPr>

</xml_diff>